<commit_message>
Cap nhat chuc nang nhan vien, sua so tai khoan QR, dong bo so do ban va cap nhat tai lieu
</commit_message>
<xml_diff>
--- a/learn-project/Web đặt bàn và menu điện tử.docx
+++ b/learn-project/Web đặt bàn và menu điện tử.docx
@@ -600,6 +600,50 @@
     </w:p>
     <w:p>
       <w:pPr>
+        <w:spacing w:after="240" w:before="0"/>
+      </w:pPr>
+      <w:r>
+        <w:rPr>
+          <w:sz w:val="24"/>
+        </w:rPr>
+        <w:t>Nhân viên check-in khách đặt bàn tại quầy, hệ thống tự động chuyển trạng thái bàn sang Đang sử dụng và tạo đơn hàng liên kết.</w:t>
+      </w:r>
+    </w:p>
+    <w:p>
+      <w:pPr>
+        <w:spacing w:after="240" w:before="0"/>
+      </w:pPr>
+      <w:r>
+        <w:rPr>
+          <w:sz w:val="24"/>
+        </w:rPr>
+        <w:t>Nhân viên lọc và tìm kiếm đặt bàn theo trạng thái (Chờ xác nhận, Đã xác nhận, Đã hoàn thành, Đã hủy), theo ngày, hoặc theo số điện thoại khách hàng.</w:t>
+      </w:r>
+    </w:p>
+    <w:p>
+      <w:pPr>
+        <w:spacing w:after="240" w:before="0"/>
+      </w:pPr>
+      <w:r>
+        <w:rPr>
+          <w:sz w:val="24"/>
+        </w:rPr>
+        <w:t>Hệ thống tự động cập nhật trạng thái bàn thành Đã đặt trước 1 tiếng trước giờ hẹn (Scheduled Task chạy mỗi phút).</w:t>
+      </w:r>
+    </w:p>
+    <w:p>
+      <w:pPr>
+        <w:spacing w:after="240" w:before="0"/>
+      </w:pPr>
+      <w:r>
+        <w:rPr>
+          <w:sz w:val="24"/>
+        </w:rPr>
+        <w:t>Hệ thống tự động hủy đặt bàn quá hạn nếu khách không check-in sau 2 tiếng, đồng thời trả bàn về trạng thái Trống.</w:t>
+      </w:r>
+    </w:p>
+    <w:p>
+      <w:pPr>
         <w:spacing w:after="240" w:before="240" w:lineRule="auto"/>
         <w:rPr>
           <w:b w:val="1"/>
@@ -806,6 +850,105 @@
     </w:p>
     <w:p>
       <w:pPr>
+        <w:spacing w:after="240" w:before="0"/>
+      </w:pPr>
+      <w:r>
+        <w:rPr>
+          <w:sz w:val="24"/>
+        </w:rPr>
+        <w:t>Nhân viên tạo đơn hàng trực tiếp cho khách walk-in (đến mà không đặt trước) bằng cách chọn bàn trống.</w:t>
+      </w:r>
+    </w:p>
+    <w:p>
+      <w:pPr>
+        <w:spacing w:after="240" w:before="0"/>
+      </w:pPr>
+      <w:r>
+        <w:rPr>
+          <w:sz w:val="24"/>
+        </w:rPr>
+        <w:t>Gọi món thêm vào đơn hàng: chọn món từ menu, nhập số lượng, ghi chú đặc biệt (ít cay, không hành…).</w:t>
+      </w:r>
+    </w:p>
+    <w:p>
+      <w:pPr>
+        <w:spacing w:after="240" w:before="0"/>
+      </w:pPr>
+      <w:r>
+        <w:rPr>
+          <w:sz w:val="24"/>
+        </w:rPr>
+        <w:t>Xóa món khỏi đơn hàng (tự động trừ tiền khỏi tổng hóa đơn).</w:t>
+      </w:r>
+    </w:p>
+    <w:p>
+      <w:pPr>
+        <w:spacing w:after="240" w:before="0"/>
+      </w:pPr>
+      <w:r>
+        <w:rPr>
+          <w:sz w:val="24"/>
+        </w:rPr>
+        <w:t>Thanh toán hóa đơn với đa phương thức: Tiền mặt (CASH), Chuyển khoản ngân hàng (BANK_TRANSFER), Ví điện tử (E_WALLET).</w:t>
+      </w:r>
+    </w:p>
+    <w:p>
+      <w:pPr>
+        <w:spacing w:after="240" w:before="0"/>
+      </w:pPr>
+      <w:r>
+        <w:rPr>
+          <w:sz w:val="24"/>
+        </w:rPr>
+        <w:t>Tích hợp mã QR thanh toán VietQR: tự động sinh mã QR chứa thông tin ngân hàng, số tiền cần thanh toán và nội dung chuyển khoản khi chọn phương thức Chuyển khoản hoặc Ví điện tử.</w:t>
+      </w:r>
+    </w:p>
+    <w:p>
+      <w:pPr>
+        <w:spacing w:after="240" w:before="0"/>
+      </w:pPr>
+      <w:r>
+        <w:rPr>
+          <w:sz w:val="24"/>
+        </w:rPr>
+        <w:t>Hỗ trợ thanh toán trước một phần (đặt cọc online): hiển thị số tiền đã thanh toán trước và số tiền cần thanh toán thêm.</w:t>
+      </w:r>
+    </w:p>
+    <w:p>
+      <w:pPr>
+        <w:spacing w:after="240" w:before="0"/>
+      </w:pPr>
+      <w:r>
+        <w:rPr>
+          <w:sz w:val="24"/>
+        </w:rPr>
+        <w:t>In hóa đơn thanh toán cho khách hàng.</w:t>
+      </w:r>
+    </w:p>
+    <w:p>
+      <w:pPr>
+        <w:spacing w:after="240" w:before="0"/>
+      </w:pPr>
+      <w:r>
+        <w:rPr>
+          <w:sz w:val="24"/>
+        </w:rPr>
+        <w:t>Đóng bàn sau khi thanh toán: giải phóng bàn về trạng thái Trống, cập nhật đơn hàng thành Hoàn thành.</w:t>
+      </w:r>
+    </w:p>
+    <w:p>
+      <w:pPr>
+        <w:spacing w:after="240" w:before="0"/>
+      </w:pPr>
+      <w:r>
+        <w:rPr>
+          <w:sz w:val="24"/>
+        </w:rPr>
+        <w:t>Hủy đơn hàng: trả bàn về trạng thái Trống, hủy đặt bàn liên quan (nếu có).</w:t>
+      </w:r>
+    </w:p>
+    <w:p>
+      <w:pPr>
         <w:spacing w:after="240" w:before="240" w:lineRule="auto"/>
         <w:rPr>
           <w:b w:val="1"/>
@@ -860,13 +1003,12 @@
           <w:bCs w:val="1"/>
           <w:rtl w:val="0"/>
         </w:rPr>
-        <w:t xml:space="preserve">Nhân viên phục vụ</w:t>
-      </w:r>
-      <w:r>
-        <w:rPr>
-          <w:rtl w:val="0"/>
-        </w:rPr>
-        <w:t xml:space="preserve">: Xem danh sách đặt bàn hôm nay, xác nhận bàn, quản lý đơn hàng trong ca làm việc.</w:t>
+        <w:t>Nhân viên phục vụ: Dashboard tổng quan ca làm việc (doanh thu hôm nay, số đặt bàn, bàn trống/đang sử dụng, đơn hàng đang phục vụ). Xem danh sách đặt bàn hôm nay, lọc theo trạng thái/ngày/SĐT. Xác nhận và check-in khách đặt bàn. Xem sơ đồ bàn ăn realtime theo khu vực (Tầng 1, Tầng 2, Sân thượng) với trạng thái Trống/Đã đặt/Đang dùng/Bảo trì. Quản lý đơn hàng: tạo order, gọi món, thanh toán đa phương thức với QR VietQR, in hóa đơn, đóng bàn. Xem lịch sử hóa đơn đã thanh toán, lọc theo khoảng thời gian. Quản lý thông tin cá nhân và đổi mật khẩu.</w:t>
+      </w:r>
+      <w:r>
+        <w:rPr>
+          <w:rtl w:val="0"/>
+        </w:rPr>
       </w:r>
     </w:p>
     <w:p>

</xml_diff>